<commit_message>
updated figures with the new confusion matrix figure
</commit_message>
<xml_diff>
--- a/Docs/EA_Journal Guidelines.docx
+++ b/Docs/EA_Journal Guidelines.docx
@@ -166,16 +166,18 @@
           <w:kern w:val="0"/>
           <w:sz w:val="21"/>
           <w:szCs w:val="21"/>
-          <w14:ligatures w14:val="none"/>
-        </w:rPr>
-      </w:pPr>
-      <w:r>
-        <w:rPr>
-          <w:rFonts w:ascii="Open Sans" w:eastAsia="Times New Roman" w:hAnsi="Open Sans" w:cs="Open Sans"/>
-          <w:color w:val="1C1D1E"/>
-          <w:kern w:val="0"/>
-          <w:sz w:val="21"/>
-          <w:szCs w:val="21"/>
+          <w:highlight w:val="green"/>
+          <w14:ligatures w14:val="none"/>
+        </w:rPr>
+      </w:pPr>
+      <w:r>
+        <w:rPr>
+          <w:rFonts w:ascii="Open Sans" w:eastAsia="Times New Roman" w:hAnsi="Open Sans" w:cs="Open Sans"/>
+          <w:color w:val="1C1D1E"/>
+          <w:kern w:val="0"/>
+          <w:sz w:val="21"/>
+          <w:szCs w:val="21"/>
+          <w:highlight w:val="green"/>
           <w14:ligatures w14:val="none"/>
         </w:rPr>
         <w:t>The title page should be included at the beginning of the Main Document file.  </w:t>
@@ -195,16 +197,18 @@
           <w:kern w:val="0"/>
           <w:sz w:val="21"/>
           <w:szCs w:val="21"/>
-          <w14:ligatures w14:val="none"/>
-        </w:rPr>
-      </w:pPr>
-      <w:r>
-        <w:rPr>
-          <w:rFonts w:ascii="Open Sans" w:eastAsia="Times New Roman" w:hAnsi="Open Sans" w:cs="Open Sans"/>
-          <w:color w:val="1C1D1E"/>
-          <w:kern w:val="0"/>
-          <w:sz w:val="21"/>
-          <w:szCs w:val="21"/>
+          <w:highlight w:val="green"/>
+          <w14:ligatures w14:val="none"/>
+        </w:rPr>
+      </w:pPr>
+      <w:r>
+        <w:rPr>
+          <w:rFonts w:ascii="Open Sans" w:eastAsia="Times New Roman" w:hAnsi="Open Sans" w:cs="Open Sans"/>
+          <w:color w:val="1C1D1E"/>
+          <w:kern w:val="0"/>
+          <w:sz w:val="21"/>
+          <w:szCs w:val="21"/>
+          <w:highlight w:val="green"/>
           <w14:ligatures w14:val="none"/>
         </w:rPr>
         <w:t xml:space="preserve">The title may contain no more than 120 characters, including spaces. The title in your manuscript must match the title </w:t>
@@ -217,6 +221,7 @@
           <w:kern w:val="0"/>
           <w:sz w:val="21"/>
           <w:szCs w:val="21"/>
+          <w:highlight w:val="green"/>
           <w14:ligatures w14:val="none"/>
         </w:rPr>
         <w:t>entered into</w:t>
@@ -229,6 +234,7 @@
           <w:kern w:val="0"/>
           <w:sz w:val="21"/>
           <w:szCs w:val="21"/>
+          <w:highlight w:val="green"/>
           <w14:ligatures w14:val="none"/>
         </w:rPr>
         <w:t xml:space="preserve"> the </w:t>
@@ -241,6 +247,7 @@
           <w:kern w:val="0"/>
           <w:sz w:val="21"/>
           <w:szCs w:val="21"/>
+          <w:highlight w:val="green"/>
           <w14:ligatures w14:val="none"/>
         </w:rPr>
         <w:t>ScholarOne</w:t>
@@ -253,6 +260,7 @@
           <w:kern w:val="0"/>
           <w:sz w:val="21"/>
           <w:szCs w:val="21"/>
+          <w:highlight w:val="green"/>
           <w14:ligatures w14:val="none"/>
         </w:rPr>
         <w:t xml:space="preserve"> online submission form.  </w:t>
@@ -272,16 +280,18 @@
           <w:kern w:val="0"/>
           <w:sz w:val="21"/>
           <w:szCs w:val="21"/>
-          <w14:ligatures w14:val="none"/>
-        </w:rPr>
-      </w:pPr>
-      <w:r>
-        <w:rPr>
-          <w:rFonts w:ascii="Open Sans" w:eastAsia="Times New Roman" w:hAnsi="Open Sans" w:cs="Open Sans"/>
-          <w:color w:val="1C1D1E"/>
-          <w:kern w:val="0"/>
-          <w:sz w:val="21"/>
-          <w:szCs w:val="21"/>
+          <w:highlight w:val="green"/>
+          <w14:ligatures w14:val="none"/>
+        </w:rPr>
+      </w:pPr>
+      <w:r>
+        <w:rPr>
+          <w:rFonts w:ascii="Open Sans" w:eastAsia="Times New Roman" w:hAnsi="Open Sans" w:cs="Open Sans"/>
+          <w:color w:val="1C1D1E"/>
+          <w:kern w:val="0"/>
+          <w:sz w:val="21"/>
+          <w:szCs w:val="21"/>
+          <w:highlight w:val="green"/>
           <w14:ligatures w14:val="none"/>
         </w:rPr>
         <w:t>If your title does not fit into the designated field in the online submission form, then you must shorten it to fit and update the manuscript to match.  </w:t>
@@ -301,16 +311,18 @@
           <w:kern w:val="0"/>
           <w:sz w:val="21"/>
           <w:szCs w:val="21"/>
-          <w14:ligatures w14:val="none"/>
-        </w:rPr>
-      </w:pPr>
-      <w:r>
-        <w:rPr>
-          <w:rFonts w:ascii="Open Sans" w:eastAsia="Times New Roman" w:hAnsi="Open Sans" w:cs="Open Sans"/>
-          <w:color w:val="1C1D1E"/>
-          <w:kern w:val="0"/>
-          <w:sz w:val="21"/>
-          <w:szCs w:val="21"/>
+          <w:highlight w:val="green"/>
+          <w14:ligatures w14:val="none"/>
+        </w:rPr>
+      </w:pPr>
+      <w:r>
+        <w:rPr>
+          <w:rFonts w:ascii="Open Sans" w:eastAsia="Times New Roman" w:hAnsi="Open Sans" w:cs="Open Sans"/>
+          <w:color w:val="1C1D1E"/>
+          <w:kern w:val="0"/>
+          <w:sz w:val="21"/>
+          <w:szCs w:val="21"/>
+          <w:highlight w:val="green"/>
           <w14:ligatures w14:val="none"/>
         </w:rPr>
         <w:t>Titles must be composed in sentence-case, capitalizing only the first word and proper nouns. If a title includes a colon between phrases, the first word following the colon should be capitalized. </w:t>
@@ -330,16 +342,18 @@
           <w:kern w:val="0"/>
           <w:sz w:val="21"/>
           <w:szCs w:val="21"/>
-          <w14:ligatures w14:val="none"/>
-        </w:rPr>
-      </w:pPr>
-      <w:r>
-        <w:rPr>
-          <w:rFonts w:ascii="Open Sans" w:eastAsia="Times New Roman" w:hAnsi="Open Sans" w:cs="Open Sans"/>
-          <w:color w:val="1C1D1E"/>
-          <w:kern w:val="0"/>
-          <w:sz w:val="21"/>
-          <w:szCs w:val="21"/>
+          <w:highlight w:val="green"/>
+          <w14:ligatures w14:val="none"/>
+        </w:rPr>
+      </w:pPr>
+      <w:r>
+        <w:rPr>
+          <w:rFonts w:ascii="Open Sans" w:eastAsia="Times New Roman" w:hAnsi="Open Sans" w:cs="Open Sans"/>
+          <w:color w:val="1C1D1E"/>
+          <w:kern w:val="0"/>
+          <w:sz w:val="21"/>
+          <w:szCs w:val="21"/>
+          <w:highlight w:val="green"/>
           <w14:ligatures w14:val="none"/>
         </w:rPr>
         <w:t>A title may include a question mark, but never a period.  </w:t>
@@ -359,16 +373,18 @@
           <w:kern w:val="0"/>
           <w:sz w:val="21"/>
           <w:szCs w:val="21"/>
-          <w14:ligatures w14:val="none"/>
-        </w:rPr>
-      </w:pPr>
-      <w:r>
-        <w:rPr>
-          <w:rFonts w:ascii="Open Sans" w:eastAsia="Times New Roman" w:hAnsi="Open Sans" w:cs="Open Sans"/>
-          <w:color w:val="1C1D1E"/>
-          <w:kern w:val="0"/>
-          <w:sz w:val="21"/>
-          <w:szCs w:val="21"/>
+          <w:highlight w:val="green"/>
+          <w14:ligatures w14:val="none"/>
+        </w:rPr>
+      </w:pPr>
+      <w:r>
+        <w:rPr>
+          <w:rFonts w:ascii="Open Sans" w:eastAsia="Times New Roman" w:hAnsi="Open Sans" w:cs="Open Sans"/>
+          <w:color w:val="1C1D1E"/>
+          <w:kern w:val="0"/>
+          <w:sz w:val="21"/>
+          <w:szCs w:val="21"/>
+          <w:highlight w:val="green"/>
           <w14:ligatures w14:val="none"/>
         </w:rPr>
         <w:t>Do not use dashes to separate a title with phrases. Use a colon (and use only one colon for a maximum of two phrases).  </w:t>
@@ -388,6 +404,7 @@
           <w:kern w:val="0"/>
           <w:sz w:val="21"/>
           <w:szCs w:val="21"/>
+          <w:highlight w:val="green"/>
           <w14:ligatures w14:val="none"/>
         </w:rPr>
       </w:pPr>
@@ -399,6 +416,7 @@
           <w:kern w:val="0"/>
           <w:sz w:val="21"/>
           <w:szCs w:val="21"/>
+          <w:highlight w:val="green"/>
           <w14:ligatures w14:val="none"/>
         </w:rPr>
         <w:t>As a general rule</w:t>
@@ -411,6 +429,7 @@
           <w:kern w:val="0"/>
           <w:sz w:val="21"/>
           <w:szCs w:val="21"/>
+          <w:highlight w:val="green"/>
           <w14:ligatures w14:val="none"/>
         </w:rPr>
         <w:t>, do not use acronyms in the title. Exceptions may be granted for well-known and widely established acronyms (such as “NEON”).  </w:t>
@@ -430,16 +449,18 @@
           <w:kern w:val="0"/>
           <w:sz w:val="21"/>
           <w:szCs w:val="21"/>
-          <w14:ligatures w14:val="none"/>
-        </w:rPr>
-      </w:pPr>
-      <w:r>
-        <w:rPr>
-          <w:rFonts w:ascii="Open Sans" w:eastAsia="Times New Roman" w:hAnsi="Open Sans" w:cs="Open Sans"/>
-          <w:color w:val="1C1D1E"/>
-          <w:kern w:val="0"/>
-          <w:sz w:val="21"/>
-          <w:szCs w:val="21"/>
+          <w:highlight w:val="green"/>
+          <w14:ligatures w14:val="none"/>
+        </w:rPr>
+      </w:pPr>
+      <w:r>
+        <w:rPr>
+          <w:rFonts w:ascii="Open Sans" w:eastAsia="Times New Roman" w:hAnsi="Open Sans" w:cs="Open Sans"/>
+          <w:color w:val="1C1D1E"/>
+          <w:kern w:val="0"/>
+          <w:sz w:val="21"/>
+          <w:szCs w:val="21"/>
+          <w:highlight w:val="green"/>
           <w14:ligatures w14:val="none"/>
         </w:rPr>
         <w:t>Do not use uncommon abbreviations in the title.  </w:t>
@@ -459,16 +480,18 @@
           <w:kern w:val="0"/>
           <w:sz w:val="21"/>
           <w:szCs w:val="21"/>
-          <w14:ligatures w14:val="none"/>
-        </w:rPr>
-      </w:pPr>
-      <w:r>
-        <w:rPr>
-          <w:rFonts w:ascii="Open Sans" w:eastAsia="Times New Roman" w:hAnsi="Open Sans" w:cs="Open Sans"/>
-          <w:color w:val="1C1D1E"/>
-          <w:kern w:val="0"/>
-          <w:sz w:val="21"/>
-          <w:szCs w:val="21"/>
+          <w:highlight w:val="green"/>
+          <w14:ligatures w14:val="none"/>
+        </w:rPr>
+      </w:pPr>
+      <w:r>
+        <w:rPr>
+          <w:rFonts w:ascii="Open Sans" w:eastAsia="Times New Roman" w:hAnsi="Open Sans" w:cs="Open Sans"/>
+          <w:color w:val="1C1D1E"/>
+          <w:kern w:val="0"/>
+          <w:sz w:val="21"/>
+          <w:szCs w:val="21"/>
+          <w:highlight w:val="green"/>
           <w14:ligatures w14:val="none"/>
         </w:rPr>
         <w:t>Genus and species names should appear in </w:t>
@@ -482,6 +505,7 @@
           <w:kern w:val="0"/>
           <w:sz w:val="21"/>
           <w:szCs w:val="21"/>
+          <w:highlight w:val="green"/>
           <w14:ligatures w14:val="none"/>
         </w:rPr>
         <w:t>italics</w:t>
@@ -493,6 +517,7 @@
           <w:kern w:val="0"/>
           <w:sz w:val="21"/>
           <w:szCs w:val="21"/>
+          <w:highlight w:val="green"/>
           <w14:ligatures w14:val="none"/>
         </w:rPr>
         <w:t>. References to taxonomic authorities should not appear in the title.</w:t>
@@ -592,16 +617,18 @@
           <w:kern w:val="0"/>
           <w:sz w:val="21"/>
           <w:szCs w:val="21"/>
-          <w14:ligatures w14:val="none"/>
-        </w:rPr>
-      </w:pPr>
-      <w:r>
-        <w:rPr>
-          <w:rFonts w:ascii="Open Sans" w:eastAsia="Times New Roman" w:hAnsi="Open Sans" w:cs="Open Sans"/>
-          <w:color w:val="1C1D1E"/>
-          <w:kern w:val="0"/>
-          <w:sz w:val="21"/>
-          <w:szCs w:val="21"/>
+          <w:highlight w:val="green"/>
+          <w14:ligatures w14:val="none"/>
+        </w:rPr>
+      </w:pPr>
+      <w:r>
+        <w:rPr>
+          <w:rFonts w:ascii="Open Sans" w:eastAsia="Times New Roman" w:hAnsi="Open Sans" w:cs="Open Sans"/>
+          <w:color w:val="1C1D1E"/>
+          <w:kern w:val="0"/>
+          <w:sz w:val="21"/>
+          <w:szCs w:val="21"/>
+          <w:highlight w:val="green"/>
           <w14:ligatures w14:val="none"/>
         </w:rPr>
         <w:t>Present the author names in a list. After each author name, use a superscript number to indicate the affiliation(s) for each author (see next point).</w:t>
@@ -709,16 +736,18 @@
           <w:kern w:val="0"/>
           <w:sz w:val="21"/>
           <w:szCs w:val="21"/>
-          <w14:ligatures w14:val="none"/>
-        </w:rPr>
-      </w:pPr>
-      <w:r>
-        <w:rPr>
-          <w:rFonts w:ascii="Open Sans" w:eastAsia="Times New Roman" w:hAnsi="Open Sans" w:cs="Open Sans"/>
-          <w:color w:val="1C1D1E"/>
-          <w:kern w:val="0"/>
-          <w:sz w:val="21"/>
-          <w:szCs w:val="21"/>
+          <w:highlight w:val="green"/>
+          <w14:ligatures w14:val="none"/>
+        </w:rPr>
+      </w:pPr>
+      <w:r>
+        <w:rPr>
+          <w:rFonts w:ascii="Open Sans" w:eastAsia="Times New Roman" w:hAnsi="Open Sans" w:cs="Open Sans"/>
+          <w:color w:val="1C1D1E"/>
+          <w:kern w:val="0"/>
+          <w:sz w:val="21"/>
+          <w:szCs w:val="21"/>
+          <w:highlight w:val="green"/>
           <w14:ligatures w14:val="none"/>
         </w:rPr>
         <w:t>An author not affiliated with an institution, entity, or business should be listed as an Independent Researcher, with city, state/province, country. </w:t>
@@ -738,16 +767,18 @@
           <w:kern w:val="0"/>
           <w:sz w:val="21"/>
           <w:szCs w:val="21"/>
-          <w14:ligatures w14:val="none"/>
-        </w:rPr>
-      </w:pPr>
-      <w:r>
-        <w:rPr>
-          <w:rFonts w:ascii="Open Sans" w:eastAsia="Times New Roman" w:hAnsi="Open Sans" w:cs="Open Sans"/>
-          <w:color w:val="1C1D1E"/>
-          <w:kern w:val="0"/>
-          <w:sz w:val="21"/>
-          <w:szCs w:val="21"/>
+          <w:highlight w:val="green"/>
+          <w14:ligatures w14:val="none"/>
+        </w:rPr>
+      </w:pPr>
+      <w:r>
+        <w:rPr>
+          <w:rFonts w:ascii="Open Sans" w:eastAsia="Times New Roman" w:hAnsi="Open Sans" w:cs="Open Sans"/>
+          <w:color w:val="1C1D1E"/>
+          <w:kern w:val="0"/>
+          <w:sz w:val="21"/>
+          <w:szCs w:val="21"/>
+          <w:highlight w:val="green"/>
           <w14:ligatures w14:val="none"/>
         </w:rPr>
         <w:t>Do not repeat affiliations; instead, repeat affiliation numbers next to authors’ names.  </w:t>
@@ -767,16 +798,18 @@
           <w:kern w:val="0"/>
           <w:sz w:val="21"/>
           <w:szCs w:val="21"/>
-          <w14:ligatures w14:val="none"/>
-        </w:rPr>
-      </w:pPr>
-      <w:r>
-        <w:rPr>
-          <w:rFonts w:ascii="Open Sans" w:eastAsia="Times New Roman" w:hAnsi="Open Sans" w:cs="Open Sans"/>
-          <w:color w:val="1C1D1E"/>
-          <w:kern w:val="0"/>
-          <w:sz w:val="21"/>
-          <w:szCs w:val="21"/>
+          <w:highlight w:val="green"/>
+          <w14:ligatures w14:val="none"/>
+        </w:rPr>
+      </w:pPr>
+      <w:r>
+        <w:rPr>
+          <w:rFonts w:ascii="Open Sans" w:eastAsia="Times New Roman" w:hAnsi="Open Sans" w:cs="Open Sans"/>
+          <w:color w:val="1C1D1E"/>
+          <w:kern w:val="0"/>
+          <w:sz w:val="21"/>
+          <w:szCs w:val="21"/>
+          <w:highlight w:val="green"/>
           <w14:ligatures w14:val="none"/>
         </w:rPr>
         <w:t>Identify the corresponding author on the title page and include one email address. The corresponding author should match the entry in the online submission form. There can be only one corresponding author. For manuscripts with differing contact and corresponding authors, denote both. See the </w:t>
@@ -789,6 +822,7 @@
             <w:kern w:val="0"/>
             <w:sz w:val="21"/>
             <w:szCs w:val="21"/>
+            <w:highlight w:val="green"/>
             <w14:ligatures w14:val="none"/>
           </w:rPr>
           <w:t>“Author Roles” section</w:t>
@@ -801,6 +835,7 @@
           <w:kern w:val="0"/>
           <w:sz w:val="21"/>
           <w:szCs w:val="21"/>
+          <w:highlight w:val="green"/>
           <w14:ligatures w14:val="none"/>
         </w:rPr>
         <w:t> for more information.</w:t>
@@ -820,16 +855,18 @@
           <w:kern w:val="0"/>
           <w:sz w:val="21"/>
           <w:szCs w:val="21"/>
-          <w14:ligatures w14:val="none"/>
-        </w:rPr>
-      </w:pPr>
-      <w:r>
-        <w:rPr>
-          <w:rFonts w:ascii="Open Sans" w:eastAsia="Times New Roman" w:hAnsi="Open Sans" w:cs="Open Sans"/>
-          <w:color w:val="1C1D1E"/>
-          <w:kern w:val="0"/>
-          <w:sz w:val="21"/>
-          <w:szCs w:val="21"/>
+          <w:highlight w:val="green"/>
+          <w14:ligatures w14:val="none"/>
+        </w:rPr>
+      </w:pPr>
+      <w:r>
+        <w:rPr>
+          <w:rFonts w:ascii="Open Sans" w:eastAsia="Times New Roman" w:hAnsi="Open Sans" w:cs="Open Sans"/>
+          <w:color w:val="1C1D1E"/>
+          <w:kern w:val="0"/>
+          <w:sz w:val="21"/>
+          <w:szCs w:val="21"/>
+          <w:highlight w:val="green"/>
           <w14:ligatures w14:val="none"/>
         </w:rPr>
         <w:t>The title page can include a brief authorship statement. This statement can cover information such as “Equal Contribution”, “Co-First Authors”, “Co-Last Authors”, “Authorship alphabetical”, or similar. More detailed descriptions of author roles should be placed in an “Author Contributions” section.</w:t>
@@ -1000,16 +1037,18 @@
           <w:kern w:val="0"/>
           <w:sz w:val="21"/>
           <w:szCs w:val="21"/>
-          <w14:ligatures w14:val="none"/>
-        </w:rPr>
-      </w:pPr>
-      <w:r>
-        <w:rPr>
-          <w:rFonts w:ascii="Open Sans" w:eastAsia="Times New Roman" w:hAnsi="Open Sans" w:cs="Open Sans"/>
-          <w:color w:val="1C1D1E"/>
-          <w:kern w:val="0"/>
-          <w:sz w:val="21"/>
-          <w:szCs w:val="21"/>
+          <w:highlight w:val="green"/>
+          <w14:ligatures w14:val="none"/>
+        </w:rPr>
+      </w:pPr>
+      <w:r>
+        <w:rPr>
+          <w:rFonts w:ascii="Open Sans" w:eastAsia="Times New Roman" w:hAnsi="Open Sans" w:cs="Open Sans"/>
+          <w:color w:val="1C1D1E"/>
+          <w:kern w:val="0"/>
+          <w:sz w:val="21"/>
+          <w:szCs w:val="21"/>
+          <w:highlight w:val="green"/>
           <w14:ligatures w14:val="none"/>
         </w:rPr>
         <w:t>Citations and URLs should not be included in an abstract.  </w:t>
@@ -1029,16 +1068,18 @@
           <w:kern w:val="0"/>
           <w:sz w:val="21"/>
           <w:szCs w:val="21"/>
-          <w14:ligatures w14:val="none"/>
-        </w:rPr>
-      </w:pPr>
-      <w:r>
-        <w:rPr>
-          <w:rFonts w:ascii="Open Sans" w:eastAsia="Times New Roman" w:hAnsi="Open Sans" w:cs="Open Sans"/>
-          <w:color w:val="1C1D1E"/>
-          <w:kern w:val="0"/>
-          <w:sz w:val="21"/>
-          <w:szCs w:val="21"/>
+          <w:highlight w:val="green"/>
+          <w14:ligatures w14:val="none"/>
+        </w:rPr>
+      </w:pPr>
+      <w:r>
+        <w:rPr>
+          <w:rFonts w:ascii="Open Sans" w:eastAsia="Times New Roman" w:hAnsi="Open Sans" w:cs="Open Sans"/>
+          <w:color w:val="1C1D1E"/>
+          <w:kern w:val="0"/>
+          <w:sz w:val="21"/>
+          <w:szCs w:val="21"/>
+          <w:highlight w:val="green"/>
           <w14:ligatures w14:val="none"/>
         </w:rPr>
         <w:t>Abstracts are length limited by article type.</w:t>
@@ -1058,16 +1099,18 @@
           <w:kern w:val="0"/>
           <w:sz w:val="21"/>
           <w:szCs w:val="21"/>
-          <w14:ligatures w14:val="none"/>
-        </w:rPr>
-      </w:pPr>
-      <w:r>
-        <w:rPr>
-          <w:rFonts w:ascii="Open Sans" w:eastAsia="Times New Roman" w:hAnsi="Open Sans" w:cs="Open Sans"/>
-          <w:color w:val="1C1D1E"/>
-          <w:kern w:val="0"/>
-          <w:sz w:val="21"/>
-          <w:szCs w:val="21"/>
+          <w:highlight w:val="green"/>
+          <w14:ligatures w14:val="none"/>
+        </w:rPr>
+      </w:pPr>
+      <w:r>
+        <w:rPr>
+          <w:rFonts w:ascii="Open Sans" w:eastAsia="Times New Roman" w:hAnsi="Open Sans" w:cs="Open Sans"/>
+          <w:color w:val="1C1D1E"/>
+          <w:kern w:val="0"/>
+          <w:sz w:val="21"/>
+          <w:szCs w:val="21"/>
+          <w:highlight w:val="green"/>
           <w14:ligatures w14:val="none"/>
         </w:rPr>
         <w:t>The abstract must be provided in English (see “Abstracts in Additional Languages”, below).</w:t>
@@ -1089,6 +1132,18 @@
           <w:kern w:val="0"/>
           <w:sz w:val="21"/>
           <w:szCs w:val="21"/>
+          <w:highlight w:val="green"/>
+          <w14:ligatures w14:val="none"/>
+        </w:rPr>
+        <w:t>Abstract length limit: 350</w:t>
+      </w:r>
+      <w:r>
+        <w:rPr>
+          <w:rFonts w:ascii="Open Sans" w:eastAsia="Times New Roman" w:hAnsi="Open Sans" w:cs="Open Sans"/>
+          <w:color w:val="1C1D1E"/>
+          <w:kern w:val="0"/>
+          <w:sz w:val="21"/>
+          <w:szCs w:val="21"/>
           <w14:ligatures w14:val="none"/>
         </w:rPr>
         <w:br/>
@@ -1097,91 +1152,16 @@
     <w:p>
       <w:pPr>
         <w:shd w:val="clear" w:color="auto" w:fill="FFFFFF"/>
-        <w:spacing w:after="100" w:afterAutospacing="1" w:line="240" w:lineRule="auto"/>
-        <w:outlineLvl w:val="4"/>
-        <w:rPr>
-          <w:rFonts w:ascii="Open Sans" w:eastAsia="Times New Roman" w:hAnsi="Open Sans" w:cs="Open Sans"/>
-          <w:b/>
-          <w:bCs/>
-          <w:color w:val="1C1D1E"/>
-          <w:kern w:val="0"/>
-          <w:sz w:val="20"/>
-          <w:szCs w:val="20"/>
-          <w14:ligatures w14:val="none"/>
-        </w:rPr>
-      </w:pPr>
-      <w:r>
-        <w:rPr>
-          <w:rFonts w:ascii="Open Sans" w:eastAsia="Times New Roman" w:hAnsi="Open Sans" w:cs="Open Sans"/>
-          <w:b/>
-          <w:bCs/>
-          <w:color w:val="1C1D1E"/>
-          <w:kern w:val="0"/>
-          <w:sz w:val="20"/>
-          <w:szCs w:val="20"/>
-          <w14:ligatures w14:val="none"/>
-        </w:rPr>
-        <w:t>Abstracts in Additional Languages</w:t>
-      </w:r>
-    </w:p>
-    <w:p>
-      <w:pPr>
-        <w:shd w:val="clear" w:color="auto" w:fill="FFFFFF"/>
-        <w:spacing w:before="100" w:beforeAutospacing="1" w:after="100" w:afterAutospacing="1" w:line="240" w:lineRule="auto"/>
-        <w:rPr>
-          <w:rFonts w:ascii="Open Sans" w:eastAsia="Times New Roman" w:hAnsi="Open Sans" w:cs="Open Sans"/>
-          <w:color w:val="1C1D1E"/>
-          <w:kern w:val="0"/>
-          <w:sz w:val="21"/>
-          <w:szCs w:val="21"/>
-          <w14:ligatures w14:val="none"/>
-        </w:rPr>
-      </w:pPr>
-      <w:r>
-        <w:rPr>
-          <w:rFonts w:ascii="Open Sans" w:eastAsia="Times New Roman" w:hAnsi="Open Sans" w:cs="Open Sans"/>
-          <w:color w:val="1C1D1E"/>
-          <w:kern w:val="0"/>
-          <w:sz w:val="21"/>
-          <w:szCs w:val="21"/>
-          <w14:ligatures w14:val="none"/>
-        </w:rPr>
-        <w:t xml:space="preserve">All submissions should be written in English; however, we also encourage authors to provide the abstract in their first language(s) or language(s) relevant to the country in which the research was conducted. These additional language abstracts will only be published online with the HTML version of the paper and will not be included in the typeset and paged PDF version. Please note that additional language abstracts will not be copyedited and will be published as provided by the authors. Authors who wish to take advantage of this option should provide </w:t>
-      </w:r>
-      <w:r>
-        <w:rPr>
-          <w:rFonts w:ascii="Open Sans" w:eastAsia="Times New Roman" w:hAnsi="Open Sans" w:cs="Open Sans"/>
-          <w:color w:val="1C1D1E"/>
-          <w:kern w:val="0"/>
-          <w:sz w:val="21"/>
-          <w:szCs w:val="21"/>
-          <w14:ligatures w14:val="none"/>
-        </w:rPr>
-        <w:lastRenderedPageBreak/>
-        <w:t>their text in the “Main Document” below the English-language version.  </w:t>
-      </w:r>
-      <w:r>
-        <w:rPr>
-          <w:rFonts w:ascii="Open Sans" w:eastAsia="Times New Roman" w:hAnsi="Open Sans" w:cs="Open Sans"/>
-          <w:color w:val="1C1D1E"/>
-          <w:kern w:val="0"/>
-          <w:sz w:val="21"/>
-          <w:szCs w:val="21"/>
-          <w14:ligatures w14:val="none"/>
-        </w:rPr>
-        <w:br/>
-      </w:r>
-      <w:r>
-        <w:rPr>
-          <w:rFonts w:ascii="Open Sans" w:eastAsia="Times New Roman" w:hAnsi="Open Sans" w:cs="Open Sans"/>
-          <w:color w:val="1C1D1E"/>
-          <w:kern w:val="0"/>
-          <w:sz w:val="21"/>
-          <w:szCs w:val="21"/>
-          <w14:ligatures w14:val="none"/>
-        </w:rPr>
-        <w:br/>
-      </w:r>
+        <w:spacing w:before="100" w:beforeAutospacing="1" w:after="100" w:afterAutospacing="1" w:line="240" w:lineRule="auto"/>
+        <w:rPr>
+          <w:rFonts w:ascii="Open Sans" w:eastAsia="Times New Roman" w:hAnsi="Open Sans" w:cs="Open Sans"/>
+          <w:color w:val="1C1D1E"/>
+          <w:kern w:val="0"/>
+          <w:sz w:val="21"/>
+          <w:szCs w:val="21"/>
+          <w14:ligatures w14:val="none"/>
+        </w:rPr>
+      </w:pPr>
     </w:p>
     <w:p>
       <w:pPr>
@@ -1283,6 +1263,7 @@
           <w:szCs w:val="21"/>
           <w14:ligatures w14:val="none"/>
         </w:rPr>
+        <w:lastRenderedPageBreak/>
         <w:t>For manuscripts that include key words, list a minimum of six and a maximum of 12 key words/phrases in a section on the title page. </w:t>
       </w:r>
       <w:r>
@@ -1307,20 +1288,26 @@
         <w:spacing w:before="100" w:beforeAutospacing="1" w:after="100" w:afterAutospacing="1" w:line="240" w:lineRule="auto"/>
         <w:rPr>
           <w:rFonts w:ascii="Open Sans" w:eastAsia="Times New Roman" w:hAnsi="Open Sans" w:cs="Open Sans"/>
-          <w:color w:val="1C1D1E"/>
-          <w:kern w:val="0"/>
-          <w:sz w:val="21"/>
-          <w:szCs w:val="21"/>
-          <w14:ligatures w14:val="none"/>
-        </w:rPr>
-      </w:pPr>
-      <w:r>
-        <w:rPr>
-          <w:rFonts w:ascii="Open Sans" w:eastAsia="Times New Roman" w:hAnsi="Open Sans" w:cs="Open Sans"/>
-          <w:color w:val="1C1D1E"/>
-          <w:kern w:val="0"/>
-          <w:sz w:val="21"/>
-          <w:szCs w:val="21"/>
+          <w:i/>
+          <w:iCs/>
+          <w:color w:val="1C1D1E"/>
+          <w:kern w:val="0"/>
+          <w:sz w:val="21"/>
+          <w:szCs w:val="21"/>
+          <w:highlight w:val="green"/>
+          <w14:ligatures w14:val="none"/>
+        </w:rPr>
+      </w:pPr>
+      <w:r>
+        <w:rPr>
+          <w:rFonts w:ascii="Open Sans" w:eastAsia="Times New Roman" w:hAnsi="Open Sans" w:cs="Open Sans"/>
+          <w:i/>
+          <w:iCs/>
+          <w:color w:val="1C1D1E"/>
+          <w:kern w:val="0"/>
+          <w:sz w:val="21"/>
+          <w:szCs w:val="21"/>
+          <w:highlight w:val="green"/>
           <w14:ligatures w14:val="none"/>
         </w:rPr>
         <w:t>The list should be presented in alphabetical order with entries separated by semicolons.  </w:t>
@@ -1574,6 +1561,7 @@
           <w:bCs/>
           <w:color w:val="1C1D1E"/>
           <w:kern w:val="0"/>
+          <w:highlight w:val="green"/>
           <w14:ligatures w14:val="none"/>
         </w:rPr>
       </w:pPr>
@@ -1584,6 +1572,7 @@
           <w:bCs/>
           <w:color w:val="1C1D1E"/>
           <w:kern w:val="0"/>
+          <w:highlight w:val="green"/>
           <w14:ligatures w14:val="none"/>
         </w:rPr>
         <w:t>SI Units</w:t>
@@ -1609,6 +1598,7 @@
           <w:kern w:val="0"/>
           <w:sz w:val="21"/>
           <w:szCs w:val="21"/>
+          <w:highlight w:val="green"/>
           <w14:ligatures w14:val="none"/>
         </w:rPr>
         <w:t>Units should conform to the International System of Units (SI) per ESA journal style. This includes units within tables, text, and figures. If measurements were made in other units, include SI equivalents.</w:t>
@@ -1661,6 +1651,7 @@
           <w:bCs/>
           <w:color w:val="1C1D1E"/>
           <w:kern w:val="0"/>
+          <w:highlight w:val="green"/>
           <w14:ligatures w14:val="none"/>
         </w:rPr>
       </w:pPr>
@@ -1671,6 +1662,7 @@
           <w:bCs/>
           <w:color w:val="1C1D1E"/>
           <w:kern w:val="0"/>
+          <w:highlight w:val="green"/>
           <w14:ligatures w14:val="none"/>
         </w:rPr>
         <w:t>Backmatter</w:t>
@@ -1689,6 +1681,7 @@
           <w:kern w:val="0"/>
           <w:sz w:val="20"/>
           <w:szCs w:val="20"/>
+          <w:highlight w:val="green"/>
           <w14:ligatures w14:val="none"/>
         </w:rPr>
       </w:pPr>
@@ -1701,9 +1694,9 @@
           <w:kern w:val="0"/>
           <w:sz w:val="20"/>
           <w:szCs w:val="20"/>
-          <w14:ligatures w14:val="none"/>
-        </w:rPr>
-        <w:lastRenderedPageBreak/>
+          <w:highlight w:val="green"/>
+          <w14:ligatures w14:val="none"/>
+        </w:rPr>
         <w:t>Acknowledgments</w:t>
       </w:r>
     </w:p>
@@ -1727,9 +1720,21 @@
           <w:kern w:val="0"/>
           <w:sz w:val="21"/>
           <w:szCs w:val="21"/>
-          <w14:ligatures w14:val="none"/>
-        </w:rPr>
-        <w:t>An acknowledgments section is optional. If including this section, it must be a single paragraph and should appear at the end of the body of the text, immediately before the References section.  </w:t>
+          <w:highlight w:val="green"/>
+          <w14:ligatures w14:val="none"/>
+        </w:rPr>
+        <w:t>An acknowledgments section is optional. If including this section, it must be a single paragraph and should appear at the end of the body of the text, immediately before the References section.</w:t>
+      </w:r>
+      <w:r>
+        <w:rPr>
+          <w:rFonts w:ascii="Open Sans" w:eastAsia="Times New Roman" w:hAnsi="Open Sans" w:cs="Open Sans"/>
+          <w:color w:val="1C1D1E"/>
+          <w:kern w:val="0"/>
+          <w:sz w:val="21"/>
+          <w:szCs w:val="21"/>
+          <w14:ligatures w14:val="none"/>
+        </w:rPr>
+        <w:t>  </w:t>
       </w:r>
       <w:r>
         <w:rPr>
@@ -1770,7 +1775,12 @@
           <w14:ligatures w14:val="none"/>
         </w:rPr>
       </w:pPr>
-      <w:r>
+    </w:p>
+    <w:p>
+      <w:pPr>
+        <w:shd w:val="clear" w:color="auto" w:fill="FFFFFF"/>
+        <w:spacing w:after="100" w:afterAutospacing="1" w:line="240" w:lineRule="auto"/>
+        <w:outlineLvl w:val="5"/>
         <w:rPr>
           <w:rFonts w:ascii="Open Sans" w:eastAsia="Times New Roman" w:hAnsi="Open Sans" w:cs="Open Sans"/>
           <w:b/>
@@ -1781,6 +1791,19 @@
           <w:szCs w:val="15"/>
           <w14:ligatures w14:val="none"/>
         </w:rPr>
+      </w:pPr>
+      <w:r>
+        <w:rPr>
+          <w:rFonts w:ascii="Open Sans" w:eastAsia="Times New Roman" w:hAnsi="Open Sans" w:cs="Open Sans"/>
+          <w:b/>
+          <w:bCs/>
+          <w:color w:val="1C1D1E"/>
+          <w:kern w:val="0"/>
+          <w:sz w:val="15"/>
+          <w:szCs w:val="15"/>
+          <w14:ligatures w14:val="none"/>
+        </w:rPr>
+        <w:lastRenderedPageBreak/>
         <w:t>Funding Source Acknowledgments</w:t>
       </w:r>
     </w:p>
@@ -2203,21 +2226,10 @@
           <w:kern w:val="0"/>
           <w:sz w:val="21"/>
           <w:szCs w:val="21"/>
-          <w14:ligatures w14:val="none"/>
-        </w:rPr>
-        <w:t xml:space="preserve">The References section of a manuscript may refer only to permanently archived material. If a reasonably diligent scholar 20 years in the future could not be assured of finding a particular </w:t>
-      </w:r>
-      <w:r>
-        <w:rPr>
-          <w:rFonts w:ascii="Open Sans" w:eastAsia="Times New Roman" w:hAnsi="Open Sans" w:cs="Open Sans"/>
-          <w:color w:val="1C1D1E"/>
-          <w:kern w:val="0"/>
-          <w:sz w:val="21"/>
-          <w:szCs w:val="21"/>
-          <w14:ligatures w14:val="none"/>
-        </w:rPr>
-        <w:lastRenderedPageBreak/>
-        <w:t xml:space="preserve">source, it should not be listed in the References section. Some Internet sources have a short half-life; material should only be included as formal citations if there is reasonable expectation of future availability. </w:t>
+          <w:highlight w:val="green"/>
+          <w14:ligatures w14:val="none"/>
+        </w:rPr>
+        <w:t xml:space="preserve">The References section of a manuscript may refer only to permanently archived material. If a reasonably diligent scholar 20 years in the future could not be assured of finding a particular source, it should not be listed in the References section. Some Internet sources have a short half-life; material should only be included as formal citations if there is reasonable expectation of future availability. </w:t>
       </w:r>
       <w:proofErr w:type="gramStart"/>
       <w:r>
@@ -2227,6 +2239,7 @@
           <w:kern w:val="0"/>
           <w:sz w:val="21"/>
           <w:szCs w:val="21"/>
+          <w:highlight w:val="green"/>
           <w14:ligatures w14:val="none"/>
         </w:rPr>
         <w:t>As a general rule</w:t>
@@ -2239,9 +2252,21 @@
           <w:kern w:val="0"/>
           <w:sz w:val="21"/>
           <w:szCs w:val="21"/>
-          <w14:ligatures w14:val="none"/>
-        </w:rPr>
-        <w:t>, any publication that has an ISSN or ISBN is acceptable but should be referenced by name (the URL may be added but is not essential).  </w:t>
+          <w:highlight w:val="green"/>
+          <w14:ligatures w14:val="none"/>
+        </w:rPr>
+        <w:t>, any publication that has an ISSN or ISBN is acceptable but should be referenced by name (the URL may be added but is not essential).</w:t>
+      </w:r>
+      <w:r>
+        <w:rPr>
+          <w:rFonts w:ascii="Open Sans" w:eastAsia="Times New Roman" w:hAnsi="Open Sans" w:cs="Open Sans"/>
+          <w:color w:val="1C1D1E"/>
+          <w:kern w:val="0"/>
+          <w:sz w:val="21"/>
+          <w:szCs w:val="21"/>
+          <w14:ligatures w14:val="none"/>
+        </w:rPr>
+        <w:t>  </w:t>
       </w:r>
       <w:r>
         <w:rPr>
@@ -2279,6 +2304,7 @@
           <w:kern w:val="0"/>
           <w:sz w:val="20"/>
           <w:szCs w:val="20"/>
+          <w:highlight w:val="green"/>
           <w14:ligatures w14:val="none"/>
         </w:rPr>
       </w:pPr>
@@ -2291,6 +2317,7 @@
           <w:kern w:val="0"/>
           <w:sz w:val="20"/>
           <w:szCs w:val="20"/>
+          <w:highlight w:val="green"/>
           <w14:ligatures w14:val="none"/>
         </w:rPr>
         <w:t>Personal and Public Communications</w:t>
@@ -2306,18 +2333,21 @@
           <w:kern w:val="0"/>
           <w:sz w:val="21"/>
           <w:szCs w:val="21"/>
-          <w14:ligatures w14:val="none"/>
-        </w:rPr>
-      </w:pPr>
-      <w:r>
-        <w:rPr>
-          <w:rFonts w:ascii="Open Sans" w:eastAsia="Times New Roman" w:hAnsi="Open Sans" w:cs="Open Sans"/>
-          <w:color w:val="1C1D1E"/>
-          <w:kern w:val="0"/>
-          <w:sz w:val="21"/>
-          <w:szCs w:val="21"/>
-          <w14:ligatures w14:val="none"/>
-        </w:rPr>
+          <w:highlight w:val="green"/>
+          <w14:ligatures w14:val="none"/>
+        </w:rPr>
+      </w:pPr>
+      <w:r>
+        <w:rPr>
+          <w:rFonts w:ascii="Open Sans" w:eastAsia="Times New Roman" w:hAnsi="Open Sans" w:cs="Open Sans"/>
+          <w:color w:val="1C1D1E"/>
+          <w:kern w:val="0"/>
+          <w:sz w:val="21"/>
+          <w:szCs w:val="21"/>
+          <w:highlight w:val="green"/>
+          <w14:ligatures w14:val="none"/>
+        </w:rPr>
+        <w:lastRenderedPageBreak/>
         <w:t>Do not list abstracts or unpublished material (e.g., articles in review) in the References section. These materials may be listed in the text as personal observations (by an author of the present manuscript, with author noted), personal communications (information from others who are identified), public communications (information in published abstracts or information publicly distributed over the Internet but not permanently archived), or unpublished manuscript (with authors identified). Any references to unpublished data must comply with the </w:t>
       </w:r>
       <w:hyperlink r:id="rId9" w:history="1">
@@ -2330,6 +2360,7 @@
             <w:kern w:val="0"/>
             <w:sz w:val="21"/>
             <w:szCs w:val="21"/>
+            <w:highlight w:val="green"/>
             <w:u w:val="single"/>
             <w14:ligatures w14:val="none"/>
           </w:rPr>
@@ -2343,6 +2374,7 @@
           <w:kern w:val="0"/>
           <w:sz w:val="21"/>
           <w:szCs w:val="21"/>
+          <w:highlight w:val="green"/>
           <w14:ligatures w14:val="none"/>
         </w:rPr>
         <w:t>. </w:t>
@@ -2368,9 +2400,21 @@
           <w:kern w:val="0"/>
           <w:sz w:val="21"/>
           <w:szCs w:val="21"/>
-          <w14:ligatures w14:val="none"/>
-        </w:rPr>
-        <w:t>The submitting author is expected to verify for all "personal communications" that the authority cited agrees to the use of their name. For public communications, the reference should include date printed or accessed, title of the source, and basic access information, such as URL. </w:t>
+          <w:highlight w:val="green"/>
+          <w14:ligatures w14:val="none"/>
+        </w:rPr>
+        <w:t>The submitting author is expected to verify for all "personal communications" that the authority cited agrees to the use of their name. For public communications, the reference should include date printed or accessed, title of the source, and basic access information, such as URL.</w:t>
+      </w:r>
+      <w:r>
+        <w:rPr>
+          <w:rFonts w:ascii="Open Sans" w:eastAsia="Times New Roman" w:hAnsi="Open Sans" w:cs="Open Sans"/>
+          <w:color w:val="1C1D1E"/>
+          <w:kern w:val="0"/>
+          <w:sz w:val="21"/>
+          <w:szCs w:val="21"/>
+          <w14:ligatures w14:val="none"/>
+        </w:rPr>
+        <w:t> </w:t>
       </w:r>
     </w:p>
     <w:p>
@@ -2409,6 +2453,7 @@
           <w:bCs/>
           <w:color w:val="1C1D1E"/>
           <w:kern w:val="0"/>
+          <w:highlight w:val="green"/>
           <w14:ligatures w14:val="none"/>
         </w:rPr>
       </w:pPr>
@@ -2419,6 +2464,7 @@
           <w:bCs/>
           <w:color w:val="1C1D1E"/>
           <w:kern w:val="0"/>
+          <w:highlight w:val="green"/>
           <w14:ligatures w14:val="none"/>
         </w:rPr>
         <w:t>Tables</w:t>
@@ -2434,16 +2480,18 @@
           <w:kern w:val="0"/>
           <w:sz w:val="21"/>
           <w:szCs w:val="21"/>
-          <w14:ligatures w14:val="none"/>
-        </w:rPr>
-      </w:pPr>
-      <w:r>
-        <w:rPr>
-          <w:rFonts w:ascii="Open Sans" w:eastAsia="Times New Roman" w:hAnsi="Open Sans" w:cs="Open Sans"/>
-          <w:color w:val="1C1D1E"/>
-          <w:kern w:val="0"/>
-          <w:sz w:val="21"/>
-          <w:szCs w:val="21"/>
+          <w:highlight w:val="green"/>
+          <w14:ligatures w14:val="none"/>
+        </w:rPr>
+      </w:pPr>
+      <w:r>
+        <w:rPr>
+          <w:rFonts w:ascii="Open Sans" w:eastAsia="Times New Roman" w:hAnsi="Open Sans" w:cs="Open Sans"/>
+          <w:color w:val="1C1D1E"/>
+          <w:kern w:val="0"/>
+          <w:sz w:val="21"/>
+          <w:szCs w:val="21"/>
+          <w:highlight w:val="green"/>
           <w14:ligatures w14:val="none"/>
         </w:rPr>
         <w:t>The following guidelines ensure tables are formatted correctly.  </w:t>
@@ -2455,6 +2503,7 @@
           <w:kern w:val="0"/>
           <w:sz w:val="21"/>
           <w:szCs w:val="21"/>
+          <w:highlight w:val="green"/>
           <w14:ligatures w14:val="none"/>
         </w:rPr>
         <w:br/>
@@ -2466,6 +2515,7 @@
           <w:kern w:val="0"/>
           <w:sz w:val="21"/>
           <w:szCs w:val="21"/>
+          <w:highlight w:val="green"/>
           <w14:ligatures w14:val="none"/>
         </w:rPr>
         <w:br/>
@@ -2484,6 +2534,7 @@
           <w:kern w:val="0"/>
           <w:sz w:val="20"/>
           <w:szCs w:val="20"/>
+          <w:highlight w:val="green"/>
           <w14:ligatures w14:val="none"/>
         </w:rPr>
       </w:pPr>
@@ -2496,6 +2547,7 @@
           <w:kern w:val="0"/>
           <w:sz w:val="20"/>
           <w:szCs w:val="20"/>
+          <w:highlight w:val="green"/>
           <w14:ligatures w14:val="none"/>
         </w:rPr>
         <w:t>General Information</w:t>
@@ -2515,16 +2567,18 @@
           <w:kern w:val="0"/>
           <w:sz w:val="21"/>
           <w:szCs w:val="21"/>
-          <w14:ligatures w14:val="none"/>
-        </w:rPr>
-      </w:pPr>
-      <w:r>
-        <w:rPr>
-          <w:rFonts w:ascii="Open Sans" w:eastAsia="Times New Roman" w:hAnsi="Open Sans" w:cs="Open Sans"/>
-          <w:color w:val="1C1D1E"/>
-          <w:kern w:val="0"/>
-          <w:sz w:val="21"/>
-          <w:szCs w:val="21"/>
+          <w:highlight w:val="green"/>
+          <w14:ligatures w14:val="none"/>
+        </w:rPr>
+      </w:pPr>
+      <w:r>
+        <w:rPr>
+          <w:rFonts w:ascii="Open Sans" w:eastAsia="Times New Roman" w:hAnsi="Open Sans" w:cs="Open Sans"/>
+          <w:color w:val="1C1D1E"/>
+          <w:kern w:val="0"/>
+          <w:sz w:val="21"/>
+          <w:szCs w:val="21"/>
+          <w:highlight w:val="green"/>
           <w14:ligatures w14:val="none"/>
         </w:rPr>
         <w:t>Tables must be placed in the Main Document, appearing in a separate section after the References section.  </w:t>
@@ -2544,16 +2598,18 @@
           <w:kern w:val="0"/>
           <w:sz w:val="21"/>
           <w:szCs w:val="21"/>
-          <w14:ligatures w14:val="none"/>
-        </w:rPr>
-      </w:pPr>
-      <w:r>
-        <w:rPr>
-          <w:rFonts w:ascii="Open Sans" w:eastAsia="Times New Roman" w:hAnsi="Open Sans" w:cs="Open Sans"/>
-          <w:color w:val="1C1D1E"/>
-          <w:kern w:val="0"/>
-          <w:sz w:val="21"/>
-          <w:szCs w:val="21"/>
+          <w:highlight w:val="green"/>
+          <w14:ligatures w14:val="none"/>
+        </w:rPr>
+      </w:pPr>
+      <w:r>
+        <w:rPr>
+          <w:rFonts w:ascii="Open Sans" w:eastAsia="Times New Roman" w:hAnsi="Open Sans" w:cs="Open Sans"/>
+          <w:color w:val="1C1D1E"/>
+          <w:kern w:val="0"/>
+          <w:sz w:val="21"/>
+          <w:szCs w:val="21"/>
+          <w:highlight w:val="green"/>
           <w14:ligatures w14:val="none"/>
         </w:rPr>
         <w:t>Tables should be numbered in the order of their discussion in the text. Each table should begin on a new page.  </w:t>
@@ -2573,16 +2629,18 @@
           <w:kern w:val="0"/>
           <w:sz w:val="21"/>
           <w:szCs w:val="21"/>
-          <w14:ligatures w14:val="none"/>
-        </w:rPr>
-      </w:pPr>
-      <w:r>
-        <w:rPr>
-          <w:rFonts w:ascii="Open Sans" w:eastAsia="Times New Roman" w:hAnsi="Open Sans" w:cs="Open Sans"/>
-          <w:color w:val="1C1D1E"/>
-          <w:kern w:val="0"/>
-          <w:sz w:val="21"/>
-          <w:szCs w:val="21"/>
+          <w:highlight w:val="green"/>
+          <w14:ligatures w14:val="none"/>
+        </w:rPr>
+      </w:pPr>
+      <w:r>
+        <w:rPr>
+          <w:rFonts w:ascii="Open Sans" w:eastAsia="Times New Roman" w:hAnsi="Open Sans" w:cs="Open Sans"/>
+          <w:color w:val="1C1D1E"/>
+          <w:kern w:val="0"/>
+          <w:sz w:val="21"/>
+          <w:szCs w:val="21"/>
+          <w:highlight w:val="green"/>
           <w14:ligatures w14:val="none"/>
         </w:rPr>
         <w:t>Tables must fit on a page in portrait orientation, widthwise.  </w:t>
@@ -2602,16 +2660,18 @@
           <w:kern w:val="0"/>
           <w:sz w:val="21"/>
           <w:szCs w:val="21"/>
-          <w14:ligatures w14:val="none"/>
-        </w:rPr>
-      </w:pPr>
-      <w:r>
-        <w:rPr>
-          <w:rFonts w:ascii="Open Sans" w:eastAsia="Times New Roman" w:hAnsi="Open Sans" w:cs="Open Sans"/>
-          <w:color w:val="1C1D1E"/>
-          <w:kern w:val="0"/>
-          <w:sz w:val="21"/>
-          <w:szCs w:val="21"/>
+          <w:highlight w:val="green"/>
+          <w14:ligatures w14:val="none"/>
+        </w:rPr>
+      </w:pPr>
+      <w:r>
+        <w:rPr>
+          <w:rFonts w:ascii="Open Sans" w:eastAsia="Times New Roman" w:hAnsi="Open Sans" w:cs="Open Sans"/>
+          <w:color w:val="1C1D1E"/>
+          <w:kern w:val="0"/>
+          <w:sz w:val="21"/>
+          <w:szCs w:val="21"/>
+          <w:highlight w:val="green"/>
           <w14:ligatures w14:val="none"/>
         </w:rPr>
         <w:t>Manuscripts must have “true” tables in an editable format, created by using the “Insert Table” function, rather than using tabs or spaces and should not appear as “pictures” imported from another program.  </w:t>
@@ -2631,16 +2691,18 @@
           <w:kern w:val="0"/>
           <w:sz w:val="21"/>
           <w:szCs w:val="21"/>
-          <w14:ligatures w14:val="none"/>
-        </w:rPr>
-      </w:pPr>
-      <w:r>
-        <w:rPr>
-          <w:rFonts w:ascii="Open Sans" w:eastAsia="Times New Roman" w:hAnsi="Open Sans" w:cs="Open Sans"/>
-          <w:color w:val="1C1D1E"/>
-          <w:kern w:val="0"/>
-          <w:sz w:val="21"/>
-          <w:szCs w:val="21"/>
+          <w:highlight w:val="green"/>
+          <w14:ligatures w14:val="none"/>
+        </w:rPr>
+      </w:pPr>
+      <w:r>
+        <w:rPr>
+          <w:rFonts w:ascii="Open Sans" w:eastAsia="Times New Roman" w:hAnsi="Open Sans" w:cs="Open Sans"/>
+          <w:color w:val="1C1D1E"/>
+          <w:kern w:val="0"/>
+          <w:sz w:val="21"/>
+          <w:szCs w:val="21"/>
+          <w:highlight w:val="green"/>
           <w14:ligatures w14:val="none"/>
         </w:rPr>
         <w:t>In Microsoft Word, select “Insert”, “Table”, then specify the number of rows and columns and fill in the individual cells.</w:t>
@@ -2656,16 +2718,18 @@
           <w:kern w:val="0"/>
           <w:sz w:val="21"/>
           <w:szCs w:val="21"/>
-          <w14:ligatures w14:val="none"/>
-        </w:rPr>
-      </w:pPr>
-      <w:r>
-        <w:rPr>
-          <w:rFonts w:ascii="Open Sans" w:eastAsia="Times New Roman" w:hAnsi="Open Sans" w:cs="Open Sans"/>
-          <w:color w:val="1C1D1E"/>
-          <w:kern w:val="0"/>
-          <w:sz w:val="21"/>
-          <w:szCs w:val="21"/>
+          <w:highlight w:val="green"/>
+          <w14:ligatures w14:val="none"/>
+        </w:rPr>
+      </w:pPr>
+      <w:r>
+        <w:rPr>
+          <w:rFonts w:ascii="Open Sans" w:eastAsia="Times New Roman" w:hAnsi="Open Sans" w:cs="Open Sans"/>
+          <w:color w:val="1C1D1E"/>
+          <w:kern w:val="0"/>
+          <w:sz w:val="21"/>
+          <w:szCs w:val="21"/>
+          <w:highlight w:val="green"/>
           <w14:ligatures w14:val="none"/>
         </w:rPr>
         <w:t> </w:t>
@@ -2684,6 +2748,7 @@
           <w:kern w:val="0"/>
           <w:sz w:val="20"/>
           <w:szCs w:val="20"/>
+          <w:highlight w:val="green"/>
           <w14:ligatures w14:val="none"/>
         </w:rPr>
       </w:pPr>
@@ -2696,6 +2761,7 @@
           <w:kern w:val="0"/>
           <w:sz w:val="20"/>
           <w:szCs w:val="20"/>
+          <w:highlight w:val="green"/>
           <w14:ligatures w14:val="none"/>
         </w:rPr>
         <w:t>Table Components and Format</w:t>
@@ -2715,19 +2781,20 @@
           <w:kern w:val="0"/>
           <w:sz w:val="21"/>
           <w:szCs w:val="21"/>
-          <w14:ligatures w14:val="none"/>
-        </w:rPr>
-      </w:pPr>
-      <w:r>
-        <w:rPr>
-          <w:rFonts w:ascii="Open Sans" w:eastAsia="Times New Roman" w:hAnsi="Open Sans" w:cs="Open Sans"/>
-          <w:color w:val="1C1D1E"/>
-          <w:kern w:val="0"/>
-          <w:sz w:val="21"/>
-          <w:szCs w:val="21"/>
-          <w14:ligatures w14:val="none"/>
-        </w:rPr>
-        <w:lastRenderedPageBreak/>
+          <w:highlight w:val="green"/>
+          <w14:ligatures w14:val="none"/>
+        </w:rPr>
+      </w:pPr>
+      <w:r>
+        <w:rPr>
+          <w:rFonts w:ascii="Open Sans" w:eastAsia="Times New Roman" w:hAnsi="Open Sans" w:cs="Open Sans"/>
+          <w:color w:val="1C1D1E"/>
+          <w:kern w:val="0"/>
+          <w:sz w:val="21"/>
+          <w:szCs w:val="21"/>
+          <w:highlight w:val="green"/>
+          <w14:ligatures w14:val="none"/>
+        </w:rPr>
         <w:t>Table captions should consist of one sentence that will appear above the body of the table. Rather than simply repeating the labels on columns and rows of the table, this caption should reveal the point of grouping certain data in the table. Statistical values and other pertinent details should be provided as notes/footnotes rather than appearing in the table’s caption. Please refer to the complete </w:t>
       </w:r>
       <w:hyperlink r:id="rId10" w:history="1">
@@ -2738,6 +2805,7 @@
             <w:kern w:val="0"/>
             <w:sz w:val="21"/>
             <w:szCs w:val="21"/>
+            <w:highlight w:val="green"/>
             <w14:ligatures w14:val="none"/>
           </w:rPr>
           <w:t>statistical analysis guidelines (PDF)</w:t>
@@ -2750,6 +2818,7 @@
           <w:kern w:val="0"/>
           <w:sz w:val="21"/>
           <w:szCs w:val="21"/>
+          <w:highlight w:val="green"/>
           <w14:ligatures w14:val="none"/>
         </w:rPr>
         <w:t> for ESA publications.  </w:t>
@@ -2769,16 +2838,18 @@
           <w:kern w:val="0"/>
           <w:sz w:val="21"/>
           <w:szCs w:val="21"/>
-          <w14:ligatures w14:val="none"/>
-        </w:rPr>
-      </w:pPr>
-      <w:r>
-        <w:rPr>
-          <w:rFonts w:ascii="Open Sans" w:eastAsia="Times New Roman" w:hAnsi="Open Sans" w:cs="Open Sans"/>
-          <w:color w:val="1C1D1E"/>
-          <w:kern w:val="0"/>
-          <w:sz w:val="21"/>
-          <w:szCs w:val="21"/>
+          <w:highlight w:val="green"/>
+          <w14:ligatures w14:val="none"/>
+        </w:rPr>
+      </w:pPr>
+      <w:r>
+        <w:rPr>
+          <w:rFonts w:ascii="Open Sans" w:eastAsia="Times New Roman" w:hAnsi="Open Sans" w:cs="Open Sans"/>
+          <w:color w:val="1C1D1E"/>
+          <w:kern w:val="0"/>
+          <w:sz w:val="21"/>
+          <w:szCs w:val="21"/>
+          <w:highlight w:val="green"/>
           <w14:ligatures w14:val="none"/>
         </w:rPr>
         <w:t>Additional details should be placed in footnotes and/or a Notes section presented at the bottom of the table.  </w:t>
@@ -2798,18 +2869,21 @@
           <w:kern w:val="0"/>
           <w:sz w:val="21"/>
           <w:szCs w:val="21"/>
-          <w14:ligatures w14:val="none"/>
-        </w:rPr>
-      </w:pPr>
-      <w:r>
-        <w:rPr>
-          <w:rFonts w:ascii="Open Sans" w:eastAsia="Times New Roman" w:hAnsi="Open Sans" w:cs="Open Sans"/>
-          <w:color w:val="1C1D1E"/>
-          <w:kern w:val="0"/>
-          <w:sz w:val="21"/>
-          <w:szCs w:val="21"/>
-          <w14:ligatures w14:val="none"/>
-        </w:rPr>
+          <w:highlight w:val="green"/>
+          <w14:ligatures w14:val="none"/>
+        </w:rPr>
+      </w:pPr>
+      <w:r>
+        <w:rPr>
+          <w:rFonts w:ascii="Open Sans" w:eastAsia="Times New Roman" w:hAnsi="Open Sans" w:cs="Open Sans"/>
+          <w:color w:val="1C1D1E"/>
+          <w:kern w:val="0"/>
+          <w:sz w:val="21"/>
+          <w:szCs w:val="21"/>
+          <w:highlight w:val="green"/>
+          <w14:ligatures w14:val="none"/>
+        </w:rPr>
+        <w:lastRenderedPageBreak/>
         <w:t>Abbreviations used in the body of the table should be identified in an Abbreviations section at the bottom of the table, in the order in which they appear in the table.  </w:t>
       </w:r>
     </w:p>
@@ -2827,16 +2901,18 @@
           <w:kern w:val="0"/>
           <w:sz w:val="21"/>
           <w:szCs w:val="21"/>
-          <w14:ligatures w14:val="none"/>
-        </w:rPr>
-      </w:pPr>
-      <w:r>
-        <w:rPr>
-          <w:rFonts w:ascii="Open Sans" w:eastAsia="Times New Roman" w:hAnsi="Open Sans" w:cs="Open Sans"/>
-          <w:color w:val="1C1D1E"/>
-          <w:kern w:val="0"/>
-          <w:sz w:val="21"/>
-          <w:szCs w:val="21"/>
+          <w:highlight w:val="green"/>
+          <w14:ligatures w14:val="none"/>
+        </w:rPr>
+      </w:pPr>
+      <w:r>
+        <w:rPr>
+          <w:rFonts w:ascii="Open Sans" w:eastAsia="Times New Roman" w:hAnsi="Open Sans" w:cs="Open Sans"/>
+          <w:color w:val="1C1D1E"/>
+          <w:kern w:val="0"/>
+          <w:sz w:val="21"/>
+          <w:szCs w:val="21"/>
+          <w:highlight w:val="green"/>
           <w14:ligatures w14:val="none"/>
         </w:rPr>
         <w:t>Tables cannot contain colors, shading, or graphics. Use type style (italics, boldface, etc.) to convey meaning and identify the meaning in a Notes section at the bottom of the table (e.g., “Values in boldface indicate significant differences.”)  </w:t>
@@ -2856,16 +2932,18 @@
           <w:kern w:val="0"/>
           <w:sz w:val="21"/>
           <w:szCs w:val="21"/>
-          <w14:ligatures w14:val="none"/>
-        </w:rPr>
-      </w:pPr>
-      <w:r>
-        <w:rPr>
-          <w:rFonts w:ascii="Open Sans" w:eastAsia="Times New Roman" w:hAnsi="Open Sans" w:cs="Open Sans"/>
-          <w:color w:val="1C1D1E"/>
-          <w:kern w:val="0"/>
-          <w:sz w:val="21"/>
-          <w:szCs w:val="21"/>
+          <w:highlight w:val="green"/>
+          <w14:ligatures w14:val="none"/>
+        </w:rPr>
+      </w:pPr>
+      <w:r>
+        <w:rPr>
+          <w:rFonts w:ascii="Open Sans" w:eastAsia="Times New Roman" w:hAnsi="Open Sans" w:cs="Open Sans"/>
+          <w:color w:val="1C1D1E"/>
+          <w:kern w:val="0"/>
+          <w:sz w:val="21"/>
+          <w:szCs w:val="21"/>
+          <w:highlight w:val="green"/>
           <w14:ligatures w14:val="none"/>
         </w:rPr>
         <w:t>Tables must be presented in a grid format, with the same number of columns in each row and the same number of rows in each column, below the column headings. Columns should read fully down, and rows should read fully across.  </w:t>
@@ -2885,16 +2963,18 @@
           <w:kern w:val="0"/>
           <w:sz w:val="21"/>
           <w:szCs w:val="21"/>
-          <w14:ligatures w14:val="none"/>
-        </w:rPr>
-      </w:pPr>
-      <w:r>
-        <w:rPr>
-          <w:rFonts w:ascii="Open Sans" w:eastAsia="Times New Roman" w:hAnsi="Open Sans" w:cs="Open Sans"/>
-          <w:color w:val="1C1D1E"/>
-          <w:kern w:val="0"/>
-          <w:sz w:val="21"/>
-          <w:szCs w:val="21"/>
+          <w:highlight w:val="green"/>
+          <w14:ligatures w14:val="none"/>
+        </w:rPr>
+      </w:pPr>
+      <w:r>
+        <w:rPr>
+          <w:rFonts w:ascii="Open Sans" w:eastAsia="Times New Roman" w:hAnsi="Open Sans" w:cs="Open Sans"/>
+          <w:color w:val="1C1D1E"/>
+          <w:kern w:val="0"/>
+          <w:sz w:val="21"/>
+          <w:szCs w:val="21"/>
+          <w:highlight w:val="green"/>
           <w14:ligatures w14:val="none"/>
         </w:rPr>
         <w:t>All columns and rows must be labeled.  </w:t>
@@ -2914,16 +2994,18 @@
           <w:kern w:val="0"/>
           <w:sz w:val="21"/>
           <w:szCs w:val="21"/>
-          <w14:ligatures w14:val="none"/>
-        </w:rPr>
-      </w:pPr>
-      <w:r>
-        <w:rPr>
-          <w:rFonts w:ascii="Open Sans" w:eastAsia="Times New Roman" w:hAnsi="Open Sans" w:cs="Open Sans"/>
-          <w:color w:val="1C1D1E"/>
-          <w:kern w:val="0"/>
-          <w:sz w:val="21"/>
-          <w:szCs w:val="21"/>
+          <w:highlight w:val="green"/>
+          <w14:ligatures w14:val="none"/>
+        </w:rPr>
+      </w:pPr>
+      <w:r>
+        <w:rPr>
+          <w:rFonts w:ascii="Open Sans" w:eastAsia="Times New Roman" w:hAnsi="Open Sans" w:cs="Open Sans"/>
+          <w:color w:val="1C1D1E"/>
+          <w:kern w:val="0"/>
+          <w:sz w:val="21"/>
+          <w:szCs w:val="21"/>
+          <w:highlight w:val="green"/>
           <w14:ligatures w14:val="none"/>
         </w:rPr>
         <w:t>All column headings should identify the contents of the column. </w:t>
@@ -2943,16 +3025,18 @@
           <w:kern w:val="0"/>
           <w:sz w:val="21"/>
           <w:szCs w:val="21"/>
-          <w14:ligatures w14:val="none"/>
-        </w:rPr>
-      </w:pPr>
-      <w:r>
-        <w:rPr>
-          <w:rFonts w:ascii="Open Sans" w:eastAsia="Times New Roman" w:hAnsi="Open Sans" w:cs="Open Sans"/>
-          <w:color w:val="1C1D1E"/>
-          <w:kern w:val="0"/>
-          <w:sz w:val="21"/>
-          <w:szCs w:val="21"/>
+          <w:highlight w:val="green"/>
+          <w14:ligatures w14:val="none"/>
+        </w:rPr>
+      </w:pPr>
+      <w:r>
+        <w:rPr>
+          <w:rFonts w:ascii="Open Sans" w:eastAsia="Times New Roman" w:hAnsi="Open Sans" w:cs="Open Sans"/>
+          <w:color w:val="1C1D1E"/>
+          <w:kern w:val="0"/>
+          <w:sz w:val="21"/>
+          <w:szCs w:val="21"/>
+          <w:highlight w:val="green"/>
           <w14:ligatures w14:val="none"/>
         </w:rPr>
         <w:t>Subparts within the body of a table can be distinguished using (a), (b), etc. labeling and/or nested labeling within the left-most column.  </w:t>
@@ -2972,16 +3056,18 @@
           <w:kern w:val="0"/>
           <w:sz w:val="21"/>
           <w:szCs w:val="21"/>
-          <w14:ligatures w14:val="none"/>
-        </w:rPr>
-      </w:pPr>
-      <w:r>
-        <w:rPr>
-          <w:rFonts w:ascii="Open Sans" w:eastAsia="Times New Roman" w:hAnsi="Open Sans" w:cs="Open Sans"/>
-          <w:color w:val="1C1D1E"/>
-          <w:kern w:val="0"/>
-          <w:sz w:val="21"/>
-          <w:szCs w:val="21"/>
+          <w:highlight w:val="green"/>
+          <w14:ligatures w14:val="none"/>
+        </w:rPr>
+      </w:pPr>
+      <w:r>
+        <w:rPr>
+          <w:rFonts w:ascii="Open Sans" w:eastAsia="Times New Roman" w:hAnsi="Open Sans" w:cs="Open Sans"/>
+          <w:color w:val="1C1D1E"/>
+          <w:kern w:val="0"/>
+          <w:sz w:val="21"/>
+          <w:szCs w:val="21"/>
+          <w:highlight w:val="green"/>
           <w14:ligatures w14:val="none"/>
         </w:rPr>
         <w:t>Table captions, notes, and footnotes must be double-spaced in 12-point Times New Roman font.  </w:t>
@@ -3001,16 +3087,18 @@
           <w:kern w:val="0"/>
           <w:sz w:val="21"/>
           <w:szCs w:val="21"/>
-          <w14:ligatures w14:val="none"/>
-        </w:rPr>
-      </w:pPr>
-      <w:r>
-        <w:rPr>
-          <w:rFonts w:ascii="Open Sans" w:eastAsia="Times New Roman" w:hAnsi="Open Sans" w:cs="Open Sans"/>
-          <w:color w:val="1C1D1E"/>
-          <w:kern w:val="0"/>
-          <w:sz w:val="21"/>
-          <w:szCs w:val="21"/>
+          <w:highlight w:val="green"/>
+          <w14:ligatures w14:val="none"/>
+        </w:rPr>
+      </w:pPr>
+      <w:r>
+        <w:rPr>
+          <w:rFonts w:ascii="Open Sans" w:eastAsia="Times New Roman" w:hAnsi="Open Sans" w:cs="Open Sans"/>
+          <w:color w:val="1C1D1E"/>
+          <w:kern w:val="0"/>
+          <w:sz w:val="21"/>
+          <w:szCs w:val="21"/>
+          <w:highlight w:val="green"/>
           <w14:ligatures w14:val="none"/>
         </w:rPr>
         <w:t>The font size within the body of a table can be reduced to a minimum of 10-point Times New Roman if needed for the table to fit in portrait orientation.  </w:t>
@@ -3030,16 +3118,18 @@
           <w:kern w:val="0"/>
           <w:sz w:val="21"/>
           <w:szCs w:val="21"/>
-          <w14:ligatures w14:val="none"/>
-        </w:rPr>
-      </w:pPr>
-      <w:r>
-        <w:rPr>
-          <w:rFonts w:ascii="Open Sans" w:eastAsia="Times New Roman" w:hAnsi="Open Sans" w:cs="Open Sans"/>
-          <w:color w:val="1C1D1E"/>
-          <w:kern w:val="0"/>
-          <w:sz w:val="21"/>
-          <w:szCs w:val="21"/>
+          <w:highlight w:val="green"/>
+          <w14:ligatures w14:val="none"/>
+        </w:rPr>
+      </w:pPr>
+      <w:r>
+        <w:rPr>
+          <w:rFonts w:ascii="Open Sans" w:eastAsia="Times New Roman" w:hAnsi="Open Sans" w:cs="Open Sans"/>
+          <w:color w:val="1C1D1E"/>
+          <w:kern w:val="0"/>
+          <w:sz w:val="21"/>
+          <w:szCs w:val="21"/>
+          <w:highlight w:val="green"/>
           <w14:ligatures w14:val="none"/>
         </w:rPr>
         <w:t>Table pages should be presented in portrait orientation.  </w:t>
@@ -3059,16 +3149,18 @@
           <w:kern w:val="0"/>
           <w:sz w:val="21"/>
           <w:szCs w:val="21"/>
-          <w14:ligatures w14:val="none"/>
-        </w:rPr>
-      </w:pPr>
-      <w:r>
-        <w:rPr>
-          <w:rFonts w:ascii="Open Sans" w:eastAsia="Times New Roman" w:hAnsi="Open Sans" w:cs="Open Sans"/>
-          <w:color w:val="1C1D1E"/>
-          <w:kern w:val="0"/>
-          <w:sz w:val="21"/>
-          <w:szCs w:val="21"/>
+          <w:highlight w:val="green"/>
+          <w14:ligatures w14:val="none"/>
+        </w:rPr>
+      </w:pPr>
+      <w:r>
+        <w:rPr>
+          <w:rFonts w:ascii="Open Sans" w:eastAsia="Times New Roman" w:hAnsi="Open Sans" w:cs="Open Sans"/>
+          <w:color w:val="1C1D1E"/>
+          <w:kern w:val="0"/>
+          <w:sz w:val="21"/>
+          <w:szCs w:val="21"/>
+          <w:highlight w:val="green"/>
           <w14:ligatures w14:val="none"/>
         </w:rPr>
         <w:t>Tables must not extend to multiple pages in the horizontal direction but may extend in the vertical direction.</w:t>
@@ -3380,7 +3472,6 @@
           <w:szCs w:val="21"/>
           <w14:ligatures w14:val="none"/>
         </w:rPr>
-        <w:lastRenderedPageBreak/>
         <w:t>Any photographs or illustrations appearing in a manuscript that were taken or produced by individuals who are not coauthors of the manuscript must be accompanied by confirmation of permission for use in the manuscript.  </w:t>
       </w:r>
     </w:p>
@@ -3464,6 +3555,7 @@
           <w:szCs w:val="21"/>
           <w14:ligatures w14:val="none"/>
         </w:rPr>
+        <w:lastRenderedPageBreak/>
         <w:t> </w:t>
       </w:r>
     </w:p>
@@ -3648,16 +3740,18 @@
           <w:kern w:val="0"/>
           <w:sz w:val="21"/>
           <w:szCs w:val="21"/>
-          <w14:ligatures w14:val="none"/>
-        </w:rPr>
-      </w:pPr>
-      <w:r>
-        <w:rPr>
-          <w:rFonts w:ascii="Open Sans" w:eastAsia="Times New Roman" w:hAnsi="Open Sans" w:cs="Open Sans"/>
-          <w:color w:val="1C1D1E"/>
-          <w:kern w:val="0"/>
-          <w:sz w:val="21"/>
-          <w:szCs w:val="21"/>
+          <w:highlight w:val="green"/>
+          <w14:ligatures w14:val="none"/>
+        </w:rPr>
+      </w:pPr>
+      <w:r>
+        <w:rPr>
+          <w:rFonts w:ascii="Open Sans" w:eastAsia="Times New Roman" w:hAnsi="Open Sans" w:cs="Open Sans"/>
+          <w:color w:val="1C1D1E"/>
+          <w:kern w:val="0"/>
+          <w:sz w:val="21"/>
+          <w:szCs w:val="21"/>
+          <w:highlight w:val="green"/>
           <w14:ligatures w14:val="none"/>
         </w:rPr>
         <w:t>Number each figure with Arabic numerals (1, 2, 3, etc.) in order of their citation in text. Label multipart figures with consecutive letters of the alphabet. Consistently label panels, using either uppercase or lowercase letters, throughout the group of figures. </w:t>
@@ -3877,16 +3971,18 @@
           <w:kern w:val="0"/>
           <w:sz w:val="21"/>
           <w:szCs w:val="21"/>
-          <w14:ligatures w14:val="none"/>
-        </w:rPr>
-      </w:pPr>
-      <w:r>
-        <w:rPr>
-          <w:rFonts w:ascii="Open Sans" w:eastAsia="Times New Roman" w:hAnsi="Open Sans" w:cs="Open Sans"/>
-          <w:color w:val="1C1D1E"/>
-          <w:kern w:val="0"/>
-          <w:sz w:val="21"/>
-          <w:szCs w:val="21"/>
+          <w:highlight w:val="green"/>
+          <w14:ligatures w14:val="none"/>
+        </w:rPr>
+      </w:pPr>
+      <w:r>
+        <w:rPr>
+          <w:rFonts w:ascii="Open Sans" w:eastAsia="Times New Roman" w:hAnsi="Open Sans" w:cs="Open Sans"/>
+          <w:color w:val="1C1D1E"/>
+          <w:kern w:val="0"/>
+          <w:sz w:val="21"/>
+          <w:szCs w:val="21"/>
+          <w:highlight w:val="green"/>
           <w14:ligatures w14:val="none"/>
         </w:rPr>
         <w:t>Grayscale patterns do not reproduce as well as solid colors or lines. Avoid small, dotted lines, thin lines, multiple levels of gray shading, and stippling. For bar graphs, use black, white, striped, hatched, or colored designs, but only if they are sufficiently widely spaced to appear distinct from one another.  </w:t>
@@ -3906,31 +4002,21 @@
           <w:kern w:val="0"/>
           <w:sz w:val="21"/>
           <w:szCs w:val="21"/>
-          <w14:ligatures w14:val="none"/>
-        </w:rPr>
-      </w:pPr>
-      <w:r>
-        <w:rPr>
-          <w:rFonts w:ascii="Open Sans" w:eastAsia="Times New Roman" w:hAnsi="Open Sans" w:cs="Open Sans"/>
-          <w:color w:val="1C1D1E"/>
-          <w:kern w:val="0"/>
-          <w:sz w:val="21"/>
-          <w:szCs w:val="21"/>
-          <w14:ligatures w14:val="none"/>
-        </w:rPr>
-        <w:t xml:space="preserve">For symbols and lines, avoid very small sizes or line thicknesses (a 1-point width stroke or greater is preferable). All elements of a figure should appear with the same degree of </w:t>
-      </w:r>
-      <w:r>
-        <w:rPr>
-          <w:rFonts w:ascii="Open Sans" w:eastAsia="Times New Roman" w:hAnsi="Open Sans" w:cs="Open Sans"/>
-          <w:color w:val="1C1D1E"/>
-          <w:kern w:val="0"/>
-          <w:sz w:val="21"/>
-          <w:szCs w:val="21"/>
-          <w14:ligatures w14:val="none"/>
-        </w:rPr>
-        <w:lastRenderedPageBreak/>
-        <w:t>intensity. If different degrees of intensity need to be conveyed, lines should differ by 1-point width for clarity.  </w:t>
+          <w:highlight w:val="green"/>
+          <w14:ligatures w14:val="none"/>
+        </w:rPr>
+      </w:pPr>
+      <w:r>
+        <w:rPr>
+          <w:rFonts w:ascii="Open Sans" w:eastAsia="Times New Roman" w:hAnsi="Open Sans" w:cs="Open Sans"/>
+          <w:color w:val="1C1D1E"/>
+          <w:kern w:val="0"/>
+          <w:sz w:val="21"/>
+          <w:szCs w:val="21"/>
+          <w:highlight w:val="green"/>
+          <w14:ligatures w14:val="none"/>
+        </w:rPr>
+        <w:t>For symbols and lines, avoid very small sizes or line thicknesses (a 1-point width stroke or greater is preferable). All elements of a figure should appear with the same degree of intensity. If different degrees of intensity need to be conveyed, lines should differ by 1-point width for clarity.  </w:t>
       </w:r>
     </w:p>
     <w:p>
@@ -3947,16 +4033,18 @@
           <w:kern w:val="0"/>
           <w:sz w:val="21"/>
           <w:szCs w:val="21"/>
-          <w14:ligatures w14:val="none"/>
-        </w:rPr>
-      </w:pPr>
-      <w:r>
-        <w:rPr>
-          <w:rFonts w:ascii="Open Sans" w:eastAsia="Times New Roman" w:hAnsi="Open Sans" w:cs="Open Sans"/>
-          <w:color w:val="1C1D1E"/>
-          <w:kern w:val="0"/>
-          <w:sz w:val="21"/>
-          <w:szCs w:val="21"/>
+          <w:highlight w:val="green"/>
+          <w14:ligatures w14:val="none"/>
+        </w:rPr>
+      </w:pPr>
+      <w:r>
+        <w:rPr>
+          <w:rFonts w:ascii="Open Sans" w:eastAsia="Times New Roman" w:hAnsi="Open Sans" w:cs="Open Sans"/>
+          <w:color w:val="1C1D1E"/>
+          <w:kern w:val="0"/>
+          <w:sz w:val="21"/>
+          <w:szCs w:val="21"/>
+          <w:highlight w:val="green"/>
           <w14:ligatures w14:val="none"/>
         </w:rPr>
         <w:t>If no important information will be lost, consider placing fewer numbers on the axes to achieve an uncluttered look.  </w:t>
@@ -3976,16 +4064,18 @@
           <w:kern w:val="0"/>
           <w:sz w:val="21"/>
           <w:szCs w:val="21"/>
-          <w14:ligatures w14:val="none"/>
-        </w:rPr>
-      </w:pPr>
-      <w:r>
-        <w:rPr>
-          <w:rFonts w:ascii="Open Sans" w:eastAsia="Times New Roman" w:hAnsi="Open Sans" w:cs="Open Sans"/>
-          <w:color w:val="1C1D1E"/>
-          <w:kern w:val="0"/>
-          <w:sz w:val="21"/>
-          <w:szCs w:val="21"/>
+          <w:highlight w:val="green"/>
+          <w14:ligatures w14:val="none"/>
+        </w:rPr>
+      </w:pPr>
+      <w:r>
+        <w:rPr>
+          <w:rFonts w:ascii="Open Sans" w:eastAsia="Times New Roman" w:hAnsi="Open Sans" w:cs="Open Sans"/>
+          <w:color w:val="1C1D1E"/>
+          <w:kern w:val="0"/>
+          <w:sz w:val="21"/>
+          <w:szCs w:val="21"/>
+          <w:highlight w:val="green"/>
           <w14:ligatures w14:val="none"/>
         </w:rPr>
         <w:t>Make figures as clean and uncluttered as possible; avoid extra gridlines and section boxes.  </w:t>
@@ -4005,18 +4095,21 @@
           <w:kern w:val="0"/>
           <w:sz w:val="21"/>
           <w:szCs w:val="21"/>
-          <w14:ligatures w14:val="none"/>
-        </w:rPr>
-      </w:pPr>
-      <w:r>
-        <w:rPr>
-          <w:rFonts w:ascii="Open Sans" w:eastAsia="Times New Roman" w:hAnsi="Open Sans" w:cs="Open Sans"/>
-          <w:color w:val="1C1D1E"/>
-          <w:kern w:val="0"/>
-          <w:sz w:val="21"/>
-          <w:szCs w:val="21"/>
-          <w14:ligatures w14:val="none"/>
-        </w:rPr>
+          <w:highlight w:val="red"/>
+          <w14:ligatures w14:val="none"/>
+        </w:rPr>
+      </w:pPr>
+      <w:r>
+        <w:rPr>
+          <w:rFonts w:ascii="Open Sans" w:eastAsia="Times New Roman" w:hAnsi="Open Sans" w:cs="Open Sans"/>
+          <w:color w:val="1C1D1E"/>
+          <w:kern w:val="0"/>
+          <w:sz w:val="21"/>
+          <w:szCs w:val="21"/>
+          <w:highlight w:val="red"/>
+          <w14:ligatures w14:val="none"/>
+        </w:rPr>
+        <w:lastRenderedPageBreak/>
         <w:t>Maps should include longitude and latitude, an indication of compass direction, a distance scale, and a thin outer line as a border. Make lines on maps bold and distinct while eliminating information not pertinent to the subject.  </w:t>
       </w:r>
     </w:p>
@@ -4491,7 +4584,6 @@
           <w:szCs w:val="21"/>
           <w14:ligatures w14:val="none"/>
         </w:rPr>
-        <w:lastRenderedPageBreak/>
         <w:t>Each appendix should be uploaded as a separate file, with all parts of an appendix merged into a single file, formatted as it is intended to appear if published. Appendices are not copyedited, assembled, or typeset by the journal’s editorial staff or publisher staff. </w:t>
       </w:r>
     </w:p>
@@ -4521,6 +4613,7 @@
           <w:szCs w:val="21"/>
           <w14:ligatures w14:val="none"/>
         </w:rPr>
+        <w:lastRenderedPageBreak/>
         <w:t>When possible, a single appendix is preferred. Please do not upload multiple appendices that each contain a small number of items. In such cases, it is more appropriate to divide a single appendix into sections as needed. </w:t>
       </w:r>
     </w:p>

</xml_diff>